<commit_message>
fix: plantilla para mejor visibilidad
</commit_message>
<xml_diff>
--- a/data/plantilla_informe.docx
+++ b/data/plantilla_informe.docx
@@ -25,7 +25,7 @@
         </w:trPr>
         <w:tc>
           <w:tcPr>
-            <w:tcW w:w="9620" w:type="dxa"/>
+            <w:tcW w:w="9395" w:type="dxa"/>
             <w:gridSpan w:val="2"/>
             <w:vAlign w:val="center"/>
           </w:tcPr>
@@ -57,13 +57,23 @@
               </w:rPr>
               <w:t xml:space="preserve">: </w:t>
             </w:r>
+            <w:proofErr w:type="gramStart"/>
             <w:r>
               <w:rPr>
                 <w:rFonts w:ascii="Calibri" w:hAnsi="Calibri" w:cs="Times New Roman"/>
                 <w:bCs/>
                 <w:szCs w:val="24"/>
               </w:rPr>
-              <w:t>{{ nombres }}</w:t>
+              <w:t>{{ nombres</w:t>
+            </w:r>
+            <w:proofErr w:type="gramEnd"/>
+            <w:r>
+              <w:rPr>
+                <w:rFonts w:ascii="Calibri" w:hAnsi="Calibri" w:cs="Times New Roman"/>
+                <w:bCs/>
+                <w:szCs w:val="24"/>
+              </w:rPr>
+              <w:t xml:space="preserve"> }}</w:t>
             </w:r>
             <w:r>
               <w:rPr>
@@ -73,21 +83,23 @@
               </w:rPr>
               <w:t xml:space="preserve"> </w:t>
             </w:r>
-            <w:r>
-              <w:rPr>
-                <w:rFonts w:ascii="Calibri" w:hAnsi="Calibri" w:cs="Times New Roman"/>
-                <w:b/>
-                <w:szCs w:val="24"/>
-              </w:rPr>
-              <w:t xml:space="preserve"> </w:t>
-            </w:r>
+            <w:proofErr w:type="gramStart"/>
             <w:r>
               <w:rPr>
                 <w:rFonts w:ascii="Calibri" w:hAnsi="Calibri" w:cs="Times New Roman"/>
                 <w:bCs/>
                 <w:szCs w:val="24"/>
               </w:rPr>
-              <w:t>{{ apellidos }}</w:t>
+              <w:t>{{ apellidos</w:t>
+            </w:r>
+            <w:proofErr w:type="gramEnd"/>
+            <w:r>
+              <w:rPr>
+                <w:rFonts w:ascii="Calibri" w:hAnsi="Calibri" w:cs="Times New Roman"/>
+                <w:bCs/>
+                <w:szCs w:val="24"/>
+              </w:rPr>
+              <w:t xml:space="preserve"> }}</w:t>
             </w:r>
           </w:p>
         </w:tc>
@@ -98,7 +110,7 @@
         </w:trPr>
         <w:tc>
           <w:tcPr>
-            <w:tcW w:w="9620" w:type="dxa"/>
+            <w:tcW w:w="9395" w:type="dxa"/>
             <w:gridSpan w:val="2"/>
             <w:vAlign w:val="center"/>
           </w:tcPr>
@@ -118,12 +130,21 @@
               </w:rPr>
               <w:t xml:space="preserve">FECHA DE PRESENTACION: </w:t>
             </w:r>
+            <w:proofErr w:type="gramStart"/>
             <w:r>
               <w:rPr>
                 <w:rFonts w:ascii="Calibri" w:hAnsi="Calibri" w:cs="Times New Roman"/>
                 <w:szCs w:val="24"/>
               </w:rPr>
-              <w:t xml:space="preserve">{{ fecha_prueba }}</w:t>
+              <w:t>{{ fecha</w:t>
+            </w:r>
+            <w:proofErr w:type="gramEnd"/>
+            <w:r>
+              <w:rPr>
+                <w:rFonts w:ascii="Calibri" w:hAnsi="Calibri" w:cs="Times New Roman"/>
+                <w:szCs w:val="24"/>
+              </w:rPr>
+              <w:t>_prueba }}</w:t>
             </w:r>
           </w:p>
         </w:tc>
@@ -134,7 +155,7 @@
         </w:trPr>
         <w:tc>
           <w:tcPr>
-            <w:tcW w:w="9620" w:type="dxa"/>
+            <w:tcW w:w="9395" w:type="dxa"/>
             <w:gridSpan w:val="2"/>
             <w:vAlign w:val="center"/>
           </w:tcPr>
@@ -143,7 +164,7 @@
               <w:spacing w:after="0" w:line="240" w:lineRule="auto"/>
               <w:rPr>
                 <w:rFonts w:ascii="Calibri" w:hAnsi="Calibri" w:cs="Times New Roman"/>
-                <w:bCs/>
+                <w:b/>
                 <w:szCs w:val="24"/>
                 <w:lang w:val="es-ES"/>
               </w:rPr>
@@ -152,116 +173,81 @@
               <w:rPr>
                 <w:rFonts w:ascii="Calibri" w:hAnsi="Calibri" w:cs="Times New Roman"/>
                 <w:b/>
-                <w:noProof/>
                 <w:szCs w:val="24"/>
-                <w:lang w:eastAsia="es-CO"/>
+                <w:lang w:val="es-ES"/>
               </w:rPr>
-              <mc:AlternateContent>
-                <mc:Choice Requires="wps">
-                  <w:drawing>
-                    <wp:anchor distT="0" distB="0" distL="114300" distR="114300" simplePos="0" relativeHeight="251657216" behindDoc="1" locked="0" layoutInCell="1" allowOverlap="1" wp14:anchorId="53256BF7" wp14:editId="1649577D">
-                      <wp:simplePos x="0" y="0"/>
-                      <wp:positionH relativeFrom="column">
-                        <wp:posOffset>1294130</wp:posOffset>
-                      </wp:positionH>
-                      <wp:positionV relativeFrom="paragraph">
-                        <wp:posOffset>23495</wp:posOffset>
-                      </wp:positionV>
-                      <wp:extent cx="130810" cy="143510"/>
-                      <wp:effectExtent l="12065" t="6985" r="9525" b="11430"/>
-                      <wp:wrapNone/>
-                      <wp:docPr id="1525175243" name="Rectangle 2"/>
-                      <wp:cNvGraphicFramePr>
-                        <a:graphicFrameLocks xmlns:a="http://schemas.openxmlformats.org/drawingml/2006/main"/>
-                      </wp:cNvGraphicFramePr>
-                      <a:graphic xmlns:a="http://schemas.openxmlformats.org/drawingml/2006/main">
-                        <a:graphicData uri="http://schemas.microsoft.com/office/word/2010/wordprocessingShape">
-                          <wps:wsp>
-                            <wps:cNvSpPr>
-                              <a:spLocks noChangeArrowheads="1"/>
-                            </wps:cNvSpPr>
-                            <wps:spPr bwMode="auto">
-                              <a:xfrm>
-                                <a:off x="0" y="0"/>
-                                <a:ext cx="130810" cy="143510"/>
-                              </a:xfrm>
-                              <a:prstGeom prst="rect">
-                                <a:avLst/>
-                              </a:prstGeom>
-                              <a:solidFill>
-                                <a:srgbClr val="FFFFFF"/>
-                              </a:solidFill>
-                              <a:ln w="9525">
-                                <a:solidFill>
-                                  <a:srgbClr val="000000"/>
-                                </a:solidFill>
-                                <a:miter lim="800000"/>
-                                <a:headEnd/>
-                                <a:tailEnd/>
-                              </a:ln>
-                            </wps:spPr>
-                            <wps:bodyPr rot="0" vert="horz" wrap="square" lIns="91440" tIns="45720" rIns="91440" bIns="45720" anchor="t" anchorCtr="0" upright="1">
-                              <a:noAutofit/>
-                            </wps:bodyPr>
-                          </wps:wsp>
-                        </a:graphicData>
-                      </a:graphic>
-                      <wp14:sizeRelH relativeFrom="page">
-                        <wp14:pctWidth>0</wp14:pctWidth>
-                      </wp14:sizeRelH>
-                      <wp14:sizeRelV relativeFrom="page">
-                        <wp14:pctHeight>0</wp14:pctHeight>
-                      </wp14:sizeRelV>
-                    </wp:anchor>
-                  </w:drawing>
-                </mc:Choice>
-                <mc:Fallback>
-                  <w:pict>
-                    <v:rect w14:anchorId="13410D23" id="Rectangle 2" o:spid="_x0000_s1026" style="position:absolute;margin-left:101.9pt;margin-top:1.85pt;width:10.3pt;height:11.3pt;z-index:-251659264;visibility:visible;mso-wrap-style:square;mso-width-percent:0;mso-height-percent:0;mso-wrap-distance-left:9pt;mso-wrap-distance-top:0;mso-wrap-distance-right:9pt;mso-wrap-distance-bottom:0;mso-position-horizontal:absolute;mso-position-horizontal-relative:text;mso-position-vertical:absolute;mso-position-vertical-relative:text;mso-width-percent:0;mso-height-percent:0;mso-width-relative:page;mso-height-relative:page;v-text-anchor:top" o:gfxdata="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"/>
-                  </w:pict>
-                </mc:Fallback>
-              </mc:AlternateContent>
+              <w:t xml:space="preserve">DOCUMENTO: </w:t>
             </w:r>
-            <w:r>
-              <w:rPr>
-                <w:rFonts w:ascii="Calibri" w:hAnsi="Calibri" w:cs="Times New Roman"/>
-                <w:b/>
-                <w:szCs w:val="24"/>
-              </w:rPr>
-              <w:t>DOCUMENTO</w:t>
-            </w:r>
-            <w:r>
-              <w:rPr>
-                <w:rFonts w:ascii="Calibri" w:hAnsi="Calibri" w:cs="Times New Roman"/>
-                <w:b/>
-                <w:szCs w:val="24"/>
-              </w:rPr>
-              <w:t xml:space="preserve">: </w:t>
-            </w:r>
+            <w:proofErr w:type="gramStart"/>
             <w:r>
               <w:rPr>
                 <w:rFonts w:ascii="Calibri" w:hAnsi="Calibri" w:cs="Times New Roman"/>
                 <w:bCs/>
                 <w:szCs w:val="24"/>
-              </w:rPr>
-              <w:t xml:space="preserve">{{ tipo_documento }} </w:t>
-            </w:r>
-            <w:r>
-              <w:rPr>
-                <w:rFonts w:ascii="Calibri" w:hAnsi="Calibri" w:cs="Times New Roman"/>
-                <w:b/>
-                <w:szCs w:val="24"/>
                 <w:lang w:val="es-ES"/>
               </w:rPr>
-              <w:t xml:space="preserve">No: </w:t>
+              <w:t xml:space="preserve">{{ </w:t>
             </w:r>
+            <w:proofErr w:type="spellStart"/>
             <w:r>
               <w:rPr>
                 <w:rFonts w:ascii="Calibri" w:hAnsi="Calibri" w:cs="Times New Roman"/>
                 <w:bCs/>
                 <w:szCs w:val="24"/>
+                <w:lang w:val="es-ES"/>
               </w:rPr>
-              <w:t xml:space="preserve">{{ identificacion }}</w:t>
+              <w:t>tipo</w:t>
+            </w:r>
+            <w:proofErr w:type="gramEnd"/>
+            <w:r>
+              <w:rPr>
+                <w:rFonts w:ascii="Calibri" w:hAnsi="Calibri" w:cs="Times New Roman"/>
+                <w:bCs/>
+                <w:szCs w:val="24"/>
+                <w:lang w:val="es-ES"/>
+              </w:rPr>
+              <w:t>_documento</w:t>
+            </w:r>
+            <w:proofErr w:type="spellEnd"/>
+            <w:r>
+              <w:rPr>
+                <w:rFonts w:ascii="Calibri" w:hAnsi="Calibri" w:cs="Times New Roman"/>
+                <w:bCs/>
+                <w:szCs w:val="24"/>
+                <w:lang w:val="es-ES"/>
+              </w:rPr>
+              <w:t xml:space="preserve">}} No: </w:t>
+            </w:r>
+            <w:proofErr w:type="gramStart"/>
+            <w:r>
+              <w:rPr>
+                <w:rFonts w:ascii="Calibri" w:hAnsi="Calibri" w:cs="Times New Roman"/>
+                <w:bCs/>
+                <w:szCs w:val="24"/>
+                <w:lang w:val="es-ES"/>
+              </w:rPr>
+              <w:t xml:space="preserve">{{ </w:t>
+            </w:r>
+            <w:proofErr w:type="spellStart"/>
+            <w:r>
+              <w:rPr>
+                <w:rFonts w:ascii="Calibri" w:hAnsi="Calibri" w:cs="Times New Roman"/>
+                <w:bCs/>
+                <w:szCs w:val="24"/>
+                <w:lang w:val="es-ES"/>
+              </w:rPr>
+              <w:t>identificacion</w:t>
+            </w:r>
+            <w:proofErr w:type="spellEnd"/>
+            <w:proofErr w:type="gramEnd"/>
+            <w:r>
+              <w:rPr>
+                <w:rFonts w:ascii="Calibri" w:hAnsi="Calibri" w:cs="Times New Roman"/>
+                <w:bCs/>
+                <w:szCs w:val="24"/>
+                <w:lang w:val="es-ES"/>
+              </w:rPr>
+              <w:t xml:space="preserve"> }}</w:t>
             </w:r>
           </w:p>
         </w:tc>
@@ -272,7 +258,7 @@
         </w:trPr>
         <w:tc>
           <w:tcPr>
-            <w:tcW w:w="9620" w:type="dxa"/>
+            <w:tcW w:w="9395" w:type="dxa"/>
             <w:gridSpan w:val="2"/>
             <w:tcBorders>
               <w:top w:val="single" w:sz="4" w:space="0" w:color="auto"/>
@@ -329,7 +315,7 @@
         </w:trPr>
         <w:tc>
           <w:tcPr>
-            <w:tcW w:w="659" w:type="dxa"/>
+            <w:tcW w:w="645" w:type="dxa"/>
             <w:tcBorders>
               <w:top w:val="single" w:sz="4" w:space="0" w:color="auto"/>
               <w:left w:val="single" w:sz="4" w:space="0" w:color="auto"/>
@@ -351,7 +337,7 @@
         </w:tc>
         <w:tc>
           <w:tcPr>
-            <w:tcW w:w="8961" w:type="dxa"/>
+            <w:tcW w:w="8750" w:type="dxa"/>
             <w:tcBorders>
               <w:top w:val="single" w:sz="4" w:space="0" w:color="auto"/>
               <w:left w:val="nil"/>
@@ -400,7 +386,7 @@
                 <w:szCs w:val="24"/>
                 <w:lang w:eastAsia="es-CO"/>
               </w:rPr>
-              <w:t xml:space="preserve">{{resultado_general}}</w:t>
+              <w:t>{{resultado_general}}</w:t>
             </w:r>
           </w:p>
           <w:p>
@@ -454,7 +440,7 @@
                 <w:szCs w:val="24"/>
                 <w:lang w:eastAsia="es-CO"/>
               </w:rPr>
-              <w:t xml:space="preserve">{{interpretacion}}</w:t>
+              <w:t>{{interpretacion}}</w:t>
             </w:r>
           </w:p>
           <w:p>
@@ -498,7 +484,7 @@
                 <w:szCs w:val="24"/>
                 <w:lang w:eastAsia="es-CO"/>
               </w:rPr>
-              <w:t xml:space="preserve">{{areas_afines}}</w:t>
+              <w:t>{{areas_afines}}</w:t>
             </w:r>
           </w:p>
           <w:p>
@@ -551,7 +537,7 @@
                 <w:szCs w:val="24"/>
                 <w:lang w:eastAsia="es-CO"/>
               </w:rPr>
-              <w:t xml:space="preserve">{{concepto_evaluador}}</w:t>
+              <w:t>{{concepto_evaluador}}</w:t>
             </w:r>
           </w:p>
           <w:p>
@@ -572,7 +558,7 @@
         </w:trPr>
         <w:tc>
           <w:tcPr>
-            <w:tcW w:w="9620" w:type="dxa"/>
+            <w:tcW w:w="9395" w:type="dxa"/>
             <w:gridSpan w:val="2"/>
           </w:tcPr>
           <w:p>
@@ -7294,7 +7280,6 @@
   <w:style w:type="character" w:default="1" w:styleId="Fuentedeprrafopredeter">
     <w:name w:val="Default Paragraph Font"/>
     <w:uiPriority w:val="1"/>
-    <w:semiHidden/>
     <w:unhideWhenUsed/>
   </w:style>
   <w:style w:type="table" w:default="1" w:styleId="Tablanormal">

</xml_diff>